<commit_message>
almost done. need to beautify and clarify few things
</commit_message>
<xml_diff>
--- a/more.docx
+++ b/more.docx
@@ -16149,6 +16149,152 @@
       </w:r>
     </w:p>
     <w:p>
+      <w:r>
+        <w:lastRenderedPageBreak/>
+        <w:t xml:space="preserve">When </w:t>
+      </w:r>
+      <w:proofErr w:type="spellStart"/>
+      <w:r>
+        <w:t>ConfigDict</w:t>
+      </w:r>
+      <w:proofErr w:type="spellEnd"/>
+      <w:r>
+        <w:t xml:space="preserve">(strict=None) (the default case) is used, </w:t>
+      </w:r>
+      <w:proofErr w:type="spellStart"/>
+      <w:r>
+        <w:t>Pydantic</w:t>
+      </w:r>
+      <w:proofErr w:type="spellEnd"/>
+      <w:r>
+        <w:t xml:space="preserve"> defaults to Lax Mode, meaning it will automatically coerce (cast) input data to match the </w:t>
+      </w:r>
+      <w:proofErr w:type="gramStart"/>
+      <w:r>
+        <w:t>type</w:t>
+      </w:r>
+      <w:proofErr w:type="gramEnd"/>
+      <w:r>
+        <w:t xml:space="preserve"> annotation whenever possible. [</w:t>
+      </w:r>
+      <w:hyperlink r:id="rId5" w:history="1">
+        <w:r>
+          <w:t>1</w:t>
+        </w:r>
+      </w:hyperlink>
+      <w:r>
+        <w:t xml:space="preserve">, </w:t>
+      </w:r>
+      <w:hyperlink r:id="rId6" w:history="1">
+        <w:r>
+          <w:t>2</w:t>
+        </w:r>
+      </w:hyperlink>
+      <w:r>
+        <w:t>]</w:t>
+      </w:r>
+    </w:p>
+    <w:p>
+      <w:r>
+        <w:t>Common data-to-data conversions include:</w:t>
+      </w:r>
+    </w:p>
+    <w:p>
+      <w:pPr>
+        <w:numPr>
+          <w:ilvl w:val="0"/>
+          <w:numId w:val="10"/>
+        </w:numPr>
+      </w:pPr>
+      <w:r>
+        <w:t>String to Numeric: "123" → 123 (int) or 123.45 (float)</w:t>
+      </w:r>
+    </w:p>
+    <w:p>
+      <w:pPr>
+        <w:numPr>
+          <w:ilvl w:val="0"/>
+          <w:numId w:val="10"/>
+        </w:numPr>
+      </w:pPr>
+      <w:r>
+        <w:t>Float to Int: 3.0 → 3</w:t>
+      </w:r>
+    </w:p>
+    <w:p>
+      <w:pPr>
+        <w:numPr>
+          <w:ilvl w:val="0"/>
+          <w:numId w:val="10"/>
+        </w:numPr>
+      </w:pPr>
+      <w:r>
+        <w:t>String to Datetime/Date: "2026-06-16" → datetime or date object</w:t>
+      </w:r>
+    </w:p>
+    <w:p>
+      <w:pPr>
+        <w:numPr>
+          <w:ilvl w:val="0"/>
+          <w:numId w:val="10"/>
+        </w:numPr>
+      </w:pPr>
+      <w:r>
+        <w:t>Tuple/Set to List: (1, 2) → [1, 2]</w:t>
+      </w:r>
+    </w:p>
+    <w:p>
+      <w:pPr>
+        <w:numPr>
+          <w:ilvl w:val="0"/>
+          <w:numId w:val="10"/>
+        </w:numPr>
+      </w:pPr>
+      <w:r>
+        <w:t>String to Boolean: "true", "on", or "1" → True [</w:t>
+      </w:r>
+      <w:hyperlink r:id="rId7" w:history="1">
+        <w:r>
+          <w:t>1</w:t>
+        </w:r>
+      </w:hyperlink>
+      <w:r>
+        <w:t xml:space="preserve">, </w:t>
+      </w:r>
+      <w:hyperlink r:id="rId8" w:history="1">
+        <w:r>
+          <w:t>2</w:t>
+        </w:r>
+      </w:hyperlink>
+      <w:r>
+        <w:t xml:space="preserve">, </w:t>
+      </w:r>
+      <w:hyperlink r:id="rId9" w:history="1">
+        <w:r>
+          <w:t>3</w:t>
+        </w:r>
+      </w:hyperlink>
+      <w:r>
+        <w:t xml:space="preserve">, </w:t>
+      </w:r>
+      <w:hyperlink r:id="rId10" w:history="1">
+        <w:r>
+          <w:t>4</w:t>
+        </w:r>
+      </w:hyperlink>
+      <w:r>
+        <w:t xml:space="preserve">, </w:t>
+      </w:r>
+      <w:hyperlink r:id="rId11" w:history="1">
+        <w:r>
+          <w:t>5</w:t>
+        </w:r>
+      </w:hyperlink>
+      <w:r>
+        <w:t>]</w:t>
+      </w:r>
+    </w:p>
+    <w:p>
       <w:pPr>
         <w:rPr>
           <w:rFonts w:ascii="Courier New" w:eastAsia="Times New Roman" w:hAnsi="Courier New" w:cs="Courier New"/>
@@ -16162,7 +16308,6 @@
           <w:sz w:val="20"/>
           <w:szCs w:val="20"/>
         </w:rPr>
-        <w:lastRenderedPageBreak/>
         <w:br w:type="page"/>
       </w:r>
     </w:p>
@@ -16245,7 +16390,7 @@
                     <pic:cNvPicPr/>
                   </pic:nvPicPr>
                   <pic:blipFill>
-                    <a:blip r:embed="rId5"/>
+                    <a:blip r:embed="rId12"/>
                     <a:stretch>
                       <a:fillRect/>
                     </a:stretch>
@@ -16285,7 +16430,7 @@
                     <pic:cNvPicPr/>
                   </pic:nvPicPr>
                   <pic:blipFill>
-                    <a:blip r:embed="rId6"/>
+                    <a:blip r:embed="rId13"/>
                     <a:stretch>
                       <a:fillRect/>
                     </a:stretch>
@@ -16320,9 +16465,9 @@
 <file path=word/numbering.xml><?xml version="1.0" encoding="utf-8"?>
 <w:numbering xmlns:wpc="http://schemas.microsoft.com/office/word/2010/wordprocessingCanvas" xmlns:cx="http://schemas.microsoft.com/office/drawing/2014/chartex" xmlns:cx1="http://schemas.microsoft.com/office/drawing/2015/9/8/chartex" xmlns:cx2="http://schemas.microsoft.com/office/drawing/2015/10/21/chartex" xmlns:cx3="http://schemas.microsoft.com/office/drawing/2016/5/9/chartex" xmlns:cx4="http://schemas.microsoft.com/office/drawing/2016/5/10/chartex" xmlns:cx5="http://schemas.microsoft.com/office/drawing/2016/5/11/chartex" xmlns:cx6="http://schemas.microsoft.com/office/drawing/2016/5/12/chartex" xmlns:cx7="http://schemas.microsoft.com/office/drawing/2016/5/13/chartex" xmlns:cx8="http://schemas.microsoft.com/office/drawing/2016/5/14/chartex" xmlns:mc="http://schemas.openxmlformats.org/markup-compatibility/2006" xmlns:aink="http://schemas.microsoft.com/office/drawing/2016/ink" xmlns:am3d="http://schemas.microsoft.com/office/drawing/2017/model3d" xmlns:o="urn:schemas-microsoft-com:office:office" xmlns:oel="http://schemas.microsoft.com/office/2019/extlst" xmlns:r="http://schemas.openxmlformats.org/officeDocument/2006/relationships" xmlns:m="http://schemas.openxmlformats.org/officeDocument/2006/math" xmlns:v="urn:schemas-microsoft-com:vml" xmlns:wp14="http://schemas.microsoft.com/office/word/2010/wordprocessingDrawing" xmlns:wp="http://schemas.openxmlformats.org/drawingml/2006/wordprocessingDrawing" xmlns:w10="urn:schemas-microsoft-com:office:word" xmlns:w="http://schemas.openxmlformats.org/wordprocessingml/2006/main" xmlns:w14="http://schemas.microsoft.com/office/word/2010/wordml" xmlns:w15="http://schemas.microsoft.com/office/word/2012/wordml" xmlns:w16cex="http://schemas.microsoft.com/office/word/2018/wordml/cex" xmlns:w16cid="http://schemas.microsoft.com/office/word/2016/wordml/cid" xmlns:w16="http://schemas.microsoft.com/office/word/2018/wordml" xmlns:w16du="http://schemas.microsoft.com/office/word/2023/wordml/word16du" xmlns:w16sdtdh="http://schemas.microsoft.com/office/word/2020/wordml/sdtdatahash" xmlns:w16sdtfl="http://schemas.microsoft.com/office/word/2024/wordml/sdtformatlock" xmlns:w16se="http://schemas.microsoft.com/office/word/2015/wordml/symex" xmlns:wpg="http://schemas.microsoft.com/office/word/2010/wordprocessingGroup" xmlns:wpi="http://schemas.microsoft.com/office/word/2010/wordprocessingInk" xmlns:wne="http://schemas.microsoft.com/office/word/2006/wordml" xmlns:wps="http://schemas.microsoft.com/office/word/2010/wordprocessingShape" mc:Ignorable="w14 w15 w16se w16cid w16 w16cex w16sdtdh w16sdtfl w16du wp14">
   <w:abstractNum w:abstractNumId="0" w15:restartNumberingAfterBreak="0">
-    <w:nsid w:val="212417AC"/>
+    <w:nsid w:val="084154FA"/>
     <w:multiLevelType w:val="multilevel"/>
-    <w:tmpl w:val="A8E04DFE"/>
+    <w:tmpl w:val="71C067C4"/>
     <w:lvl w:ilvl="0">
       <w:start w:val="1"/>
       <w:numFmt w:val="bullet"/>
@@ -16469,6 +16614,155 @@
     </w:lvl>
   </w:abstractNum>
   <w:abstractNum w:abstractNumId="1" w15:restartNumberingAfterBreak="0">
+    <w:nsid w:val="212417AC"/>
+    <w:multiLevelType w:val="multilevel"/>
+    <w:tmpl w:val="A8E04DFE"/>
+    <w:lvl w:ilvl="0">
+      <w:start w:val="1"/>
+      <w:numFmt w:val="bullet"/>
+      <w:lvlText w:val=""/>
+      <w:lvlJc w:val="left"/>
+      <w:pPr>
+        <w:tabs>
+          <w:tab w:val="num" w:pos="720"/>
+        </w:tabs>
+        <w:ind w:left="720" w:hanging="360"/>
+      </w:pPr>
+      <w:rPr>
+        <w:rFonts w:ascii="Symbol" w:hAnsi="Symbol" w:hint="default"/>
+        <w:sz w:val="20"/>
+      </w:rPr>
+    </w:lvl>
+    <w:lvl w:ilvl="1" w:tentative="1">
+      <w:start w:val="1"/>
+      <w:numFmt w:val="bullet"/>
+      <w:lvlText w:val="o"/>
+      <w:lvlJc w:val="left"/>
+      <w:pPr>
+        <w:tabs>
+          <w:tab w:val="num" w:pos="1440"/>
+        </w:tabs>
+        <w:ind w:left="1440" w:hanging="360"/>
+      </w:pPr>
+      <w:rPr>
+        <w:rFonts w:ascii="Courier New" w:hAnsi="Courier New" w:hint="default"/>
+        <w:sz w:val="20"/>
+      </w:rPr>
+    </w:lvl>
+    <w:lvl w:ilvl="2" w:tentative="1">
+      <w:start w:val="1"/>
+      <w:numFmt w:val="bullet"/>
+      <w:lvlText w:val=""/>
+      <w:lvlJc w:val="left"/>
+      <w:pPr>
+        <w:tabs>
+          <w:tab w:val="num" w:pos="2160"/>
+        </w:tabs>
+        <w:ind w:left="2160" w:hanging="360"/>
+      </w:pPr>
+      <w:rPr>
+        <w:rFonts w:ascii="Wingdings" w:hAnsi="Wingdings" w:hint="default"/>
+        <w:sz w:val="20"/>
+      </w:rPr>
+    </w:lvl>
+    <w:lvl w:ilvl="3" w:tentative="1">
+      <w:start w:val="1"/>
+      <w:numFmt w:val="bullet"/>
+      <w:lvlText w:val=""/>
+      <w:lvlJc w:val="left"/>
+      <w:pPr>
+        <w:tabs>
+          <w:tab w:val="num" w:pos="2880"/>
+        </w:tabs>
+        <w:ind w:left="2880" w:hanging="360"/>
+      </w:pPr>
+      <w:rPr>
+        <w:rFonts w:ascii="Wingdings" w:hAnsi="Wingdings" w:hint="default"/>
+        <w:sz w:val="20"/>
+      </w:rPr>
+    </w:lvl>
+    <w:lvl w:ilvl="4" w:tentative="1">
+      <w:start w:val="1"/>
+      <w:numFmt w:val="bullet"/>
+      <w:lvlText w:val=""/>
+      <w:lvlJc w:val="left"/>
+      <w:pPr>
+        <w:tabs>
+          <w:tab w:val="num" w:pos="3600"/>
+        </w:tabs>
+        <w:ind w:left="3600" w:hanging="360"/>
+      </w:pPr>
+      <w:rPr>
+        <w:rFonts w:ascii="Wingdings" w:hAnsi="Wingdings" w:hint="default"/>
+        <w:sz w:val="20"/>
+      </w:rPr>
+    </w:lvl>
+    <w:lvl w:ilvl="5" w:tentative="1">
+      <w:start w:val="1"/>
+      <w:numFmt w:val="bullet"/>
+      <w:lvlText w:val=""/>
+      <w:lvlJc w:val="left"/>
+      <w:pPr>
+        <w:tabs>
+          <w:tab w:val="num" w:pos="4320"/>
+        </w:tabs>
+        <w:ind w:left="4320" w:hanging="360"/>
+      </w:pPr>
+      <w:rPr>
+        <w:rFonts w:ascii="Wingdings" w:hAnsi="Wingdings" w:hint="default"/>
+        <w:sz w:val="20"/>
+      </w:rPr>
+    </w:lvl>
+    <w:lvl w:ilvl="6" w:tentative="1">
+      <w:start w:val="1"/>
+      <w:numFmt w:val="bullet"/>
+      <w:lvlText w:val=""/>
+      <w:lvlJc w:val="left"/>
+      <w:pPr>
+        <w:tabs>
+          <w:tab w:val="num" w:pos="5040"/>
+        </w:tabs>
+        <w:ind w:left="5040" w:hanging="360"/>
+      </w:pPr>
+      <w:rPr>
+        <w:rFonts w:ascii="Wingdings" w:hAnsi="Wingdings" w:hint="default"/>
+        <w:sz w:val="20"/>
+      </w:rPr>
+    </w:lvl>
+    <w:lvl w:ilvl="7" w:tentative="1">
+      <w:start w:val="1"/>
+      <w:numFmt w:val="bullet"/>
+      <w:lvlText w:val=""/>
+      <w:lvlJc w:val="left"/>
+      <w:pPr>
+        <w:tabs>
+          <w:tab w:val="num" w:pos="5760"/>
+        </w:tabs>
+        <w:ind w:left="5760" w:hanging="360"/>
+      </w:pPr>
+      <w:rPr>
+        <w:rFonts w:ascii="Wingdings" w:hAnsi="Wingdings" w:hint="default"/>
+        <w:sz w:val="20"/>
+      </w:rPr>
+    </w:lvl>
+    <w:lvl w:ilvl="8" w:tentative="1">
+      <w:start w:val="1"/>
+      <w:numFmt w:val="bullet"/>
+      <w:lvlText w:val=""/>
+      <w:lvlJc w:val="left"/>
+      <w:pPr>
+        <w:tabs>
+          <w:tab w:val="num" w:pos="6480"/>
+        </w:tabs>
+        <w:ind w:left="6480" w:hanging="360"/>
+      </w:pPr>
+      <w:rPr>
+        <w:rFonts w:ascii="Wingdings" w:hAnsi="Wingdings" w:hint="default"/>
+        <w:sz w:val="20"/>
+      </w:rPr>
+    </w:lvl>
+  </w:abstractNum>
+  <w:abstractNum w:abstractNumId="2" w15:restartNumberingAfterBreak="0">
     <w:nsid w:val="2D8A530C"/>
     <w:multiLevelType w:val="multilevel"/>
     <w:tmpl w:val="637CFF58"/>
@@ -16585,7 +16879,7 @@
       </w:pPr>
     </w:lvl>
   </w:abstractNum>
-  <w:abstractNum w:abstractNumId="2" w15:restartNumberingAfterBreak="0">
+  <w:abstractNum w:abstractNumId="3" w15:restartNumberingAfterBreak="0">
     <w:nsid w:val="36A93A07"/>
     <w:multiLevelType w:val="multilevel"/>
     <w:tmpl w:val="B4EA0A9C"/>
@@ -16734,7 +17028,7 @@
       </w:rPr>
     </w:lvl>
   </w:abstractNum>
-  <w:abstractNum w:abstractNumId="3" w15:restartNumberingAfterBreak="0">
+  <w:abstractNum w:abstractNumId="4" w15:restartNumberingAfterBreak="0">
     <w:nsid w:val="3A614C76"/>
     <w:multiLevelType w:val="multilevel"/>
     <w:tmpl w:val="0C3239BC"/>
@@ -16851,7 +17145,7 @@
       </w:pPr>
     </w:lvl>
   </w:abstractNum>
-  <w:abstractNum w:abstractNumId="4" w15:restartNumberingAfterBreak="0">
+  <w:abstractNum w:abstractNumId="5" w15:restartNumberingAfterBreak="0">
     <w:nsid w:val="52972854"/>
     <w:multiLevelType w:val="multilevel"/>
     <w:tmpl w:val="C26E777E"/>
@@ -17000,7 +17294,7 @@
       </w:rPr>
     </w:lvl>
   </w:abstractNum>
-  <w:abstractNum w:abstractNumId="5" w15:restartNumberingAfterBreak="0">
+  <w:abstractNum w:abstractNumId="6" w15:restartNumberingAfterBreak="0">
     <w:nsid w:val="56F13579"/>
     <w:multiLevelType w:val="multilevel"/>
     <w:tmpl w:val="5974394A"/>
@@ -17149,7 +17443,7 @@
       </w:rPr>
     </w:lvl>
   </w:abstractNum>
-  <w:abstractNum w:abstractNumId="6" w15:restartNumberingAfterBreak="0">
+  <w:abstractNum w:abstractNumId="7" w15:restartNumberingAfterBreak="0">
     <w:nsid w:val="58297146"/>
     <w:multiLevelType w:val="multilevel"/>
     <w:tmpl w:val="C454778C"/>
@@ -17298,7 +17592,7 @@
       </w:rPr>
     </w:lvl>
   </w:abstractNum>
-  <w:abstractNum w:abstractNumId="7" w15:restartNumberingAfterBreak="0">
+  <w:abstractNum w:abstractNumId="8" w15:restartNumberingAfterBreak="0">
     <w:nsid w:val="6835149C"/>
     <w:multiLevelType w:val="multilevel"/>
     <w:tmpl w:val="9182C4DA"/>
@@ -17447,7 +17741,7 @@
       </w:rPr>
     </w:lvl>
   </w:abstractNum>
-  <w:abstractNum w:abstractNumId="8" w15:restartNumberingAfterBreak="0">
+  <w:abstractNum w:abstractNumId="9" w15:restartNumberingAfterBreak="0">
     <w:nsid w:val="7928367D"/>
     <w:multiLevelType w:val="multilevel"/>
     <w:tmpl w:val="1E223FCE"/>
@@ -17597,31 +17891,34 @@
     </w:lvl>
   </w:abstractNum>
   <w:num w:numId="1" w16cid:durableId="580527208">
+    <w:abstractNumId w:val="9"/>
+  </w:num>
+  <w:num w:numId="2" w16cid:durableId="618606910">
+    <w:abstractNumId w:val="7"/>
+  </w:num>
+  <w:num w:numId="3" w16cid:durableId="1363243576">
+    <w:abstractNumId w:val="5"/>
+  </w:num>
+  <w:num w:numId="4" w16cid:durableId="163595287">
+    <w:abstractNumId w:val="6"/>
+  </w:num>
+  <w:num w:numId="5" w16cid:durableId="1785803088">
     <w:abstractNumId w:val="8"/>
   </w:num>
-  <w:num w:numId="2" w16cid:durableId="618606910">
-    <w:abstractNumId w:val="6"/>
+  <w:num w:numId="6" w16cid:durableId="565918903">
+    <w:abstractNumId w:val="3"/>
   </w:num>
-  <w:num w:numId="3" w16cid:durableId="1363243576">
+  <w:num w:numId="7" w16cid:durableId="1714116514">
     <w:abstractNumId w:val="4"/>
   </w:num>
-  <w:num w:numId="4" w16cid:durableId="163595287">
-    <w:abstractNumId w:val="5"/>
+  <w:num w:numId="8" w16cid:durableId="985745641">
+    <w:abstractNumId w:val="1"/>
   </w:num>
-  <w:num w:numId="5" w16cid:durableId="1785803088">
-    <w:abstractNumId w:val="7"/>
-  </w:num>
-  <w:num w:numId="6" w16cid:durableId="565918903">
+  <w:num w:numId="9" w16cid:durableId="349063425">
     <w:abstractNumId w:val="2"/>
   </w:num>
-  <w:num w:numId="7" w16cid:durableId="1714116514">
-    <w:abstractNumId w:val="3"/>
-  </w:num>
-  <w:num w:numId="8" w16cid:durableId="985745641">
+  <w:num w:numId="10" w16cid:durableId="860751102">
     <w:abstractNumId w:val="0"/>
-  </w:num>
-  <w:num w:numId="9" w16cid:durableId="349063425">
-    <w:abstractNumId w:val="1"/>
   </w:num>
 </w:numbering>
 </file>
@@ -18817,6 +19114,29 @@
       </w:tcPr>
     </w:tblStylePr>
   </w:style>
+  <w:style w:type="character" w:styleId="Hyperlink">
+    <w:name w:val="Hyperlink"/>
+    <w:basedOn w:val="DefaultParagraphFont"/>
+    <w:uiPriority w:val="99"/>
+    <w:unhideWhenUsed/>
+    <w:rsid w:val="00337893"/>
+    <w:rPr>
+      <w:color w:val="0563C1" w:themeColor="hyperlink"/>
+      <w:u w:val="single"/>
+    </w:rPr>
+  </w:style>
+  <w:style w:type="character" w:styleId="UnresolvedMention">
+    <w:name w:val="Unresolved Mention"/>
+    <w:basedOn w:val="DefaultParagraphFont"/>
+    <w:uiPriority w:val="99"/>
+    <w:semiHidden/>
+    <w:unhideWhenUsed/>
+    <w:rsid w:val="00337893"/>
+    <w:rPr>
+      <w:color w:val="605E5C"/>
+      <w:shd w:val="clear" w:color="auto" w:fill="E1DFDD"/>
+    </w:rPr>
+  </w:style>
 </w:styles>
 </file>
 

</xml_diff>